<commit_message>
Revisión U11: numeración de puntos, ACL de los labs, snippet AP y erratas
</commit_message>
<xml_diff>
--- a/docx/11-redes-inalambricas/11-redes-inalambricas.docx
+++ b/docx/11-redes-inalambricas/11-redes-inalambricas.docx
@@ -1139,7 +1139,7 @@
         <w:pStyle w:val="Heading1"/>
       </w:pPr>
       <w:r>
-        <w:t xml:space="preserve">01 — El medio inalámbrico</w:t>
+        <w:t xml:space="preserve">1 — El medio inalámbrico</w:t>
       </w:r>
     </w:p>
     <w:p>
@@ -1187,7 +1187,7 @@
         <w:t xml:space="preserve"> </w:t>
       </w:r>
       <w:r>
-        <w:t xml:space="preserve">→ 01 · El medio inalámbrico</w:t>
+        <w:t xml:space="preserve">→ 1 · El medio inalámbrico</w:t>
       </w:r>
     </w:p>
     <w:p>
@@ -2290,7 +2290,7 @@
         <w:t xml:space="preserve">ruido de fondo/SNR</w:t>
       </w:r>
       <w:r>
-        <w:t xml:space="preserve">. Con −55 dBm de señal y mucho ruido, la relación señal/ruido es mala y el rendimiento se hunde. Medir señal sin ruido es media diagnosis.</w:t>
+        <w:t xml:space="preserve">. Con −55 dBm de señal y mucho ruido, la relación señal/ruido es mala y el rendimiento se hunde. Medir señal sin ruido es solo la mitad del diagnóstico.</w:t>
       </w:r>
     </w:p>
     <w:p>
@@ -2660,7 +2660,7 @@
           <w:rPr>
             <w:rStyle w:val="Hyperlink"/>
           </w:rPr>
-          <w:t xml:space="preserve">02 · Medios y antenas</w:t>
+          <w:t xml:space="preserve">2 · Medios y antenas</w:t>
         </w:r>
       </w:hyperlink>
     </w:p>
@@ -2672,7 +2672,7 @@
         <w:pStyle w:val="Heading1"/>
       </w:pPr>
       <w:r>
-        <w:t xml:space="preserve">02 — Medios y antenas</w:t>
+        <w:t xml:space="preserve">2 — Medios y antenas</w:t>
       </w:r>
     </w:p>
     <w:p>
@@ -2720,7 +2720,7 @@
         <w:t xml:space="preserve"> </w:t>
       </w:r>
       <w:r>
-        <w:t xml:space="preserve">→ 02 · Medios y antenas</w:t>
+        <w:t xml:space="preserve">→ 2 · Medios y antenas</w:t>
       </w:r>
     </w:p>
     <w:p>
@@ -3807,7 +3807,7 @@
           <w:rPr>
             <w:rStyle w:val="Hyperlink"/>
           </w:rPr>
-          <w:t xml:space="preserve">01 · El medio inalámbrico</w:t>
+          <w:t xml:space="preserve">1 · El medio inalámbrico</w:t>
         </w:r>
       </w:hyperlink>
       <w:r>
@@ -3834,7 +3834,7 @@
           <w:rPr>
             <w:rStyle w:val="Hyperlink"/>
           </w:rPr>
-          <w:t xml:space="preserve">03 · Estándares 802.11</w:t>
+          <w:t xml:space="preserve">3 · Estándares 802.11</w:t>
         </w:r>
       </w:hyperlink>
     </w:p>
@@ -3846,7 +3846,7 @@
         <w:pStyle w:val="Heading1"/>
       </w:pPr>
       <w:r>
-        <w:t xml:space="preserve">03 — Estándares 802.11</w:t>
+        <w:t xml:space="preserve">3 — Estándares 802.11</w:t>
       </w:r>
     </w:p>
     <w:p>
@@ -3894,7 +3894,7 @@
         <w:t xml:space="preserve"> </w:t>
       </w:r>
       <w:r>
-        <w:t xml:space="preserve">→ 03 · Estándares 802.11</w:t>
+        <w:t xml:space="preserve">→ 3 · Estándares 802.11</w:t>
       </w:r>
     </w:p>
     <w:p>
@@ -5858,7 +5858,7 @@
           <w:rPr>
             <w:rStyle w:val="Hyperlink"/>
           </w:rPr>
-          <w:t xml:space="preserve">02 · Medios y antenas</w:t>
+          <w:t xml:space="preserve">2 · Medios y antenas</w:t>
         </w:r>
       </w:hyperlink>
       <w:r>
@@ -5885,7 +5885,7 @@
           <w:rPr>
             <w:rStyle w:val="Hyperlink"/>
           </w:rPr>
-          <w:t xml:space="preserve">04 · Topologías y modos de trabajo</w:t>
+          <w:t xml:space="preserve">4 · Topologías y modos de trabajo</w:t>
         </w:r>
       </w:hyperlink>
     </w:p>
@@ -5897,7 +5897,7 @@
         <w:pStyle w:val="Heading1"/>
       </w:pPr>
       <w:r>
-        <w:t xml:space="preserve">04 — Topologías y modos de trabajo</w:t>
+        <w:t xml:space="preserve">4 — Topologías y modos de trabajo</w:t>
       </w:r>
     </w:p>
     <w:p>
@@ -5945,7 +5945,7 @@
         <w:t xml:space="preserve"> </w:t>
       </w:r>
       <w:r>
-        <w:t xml:space="preserve">→ 04 · Topologías y modos de trabajo</w:t>
+        <w:t xml:space="preserve">→ 4 · Topologías y modos de trabajo</w:t>
       </w:r>
     </w:p>
     <w:p>
@@ -6197,7 +6197,7 @@
               <w:t xml:space="preserve"> </w:t>
             </w:r>
             <w:r>
-              <w:t xml:space="preserve">(Extended SS)</w:t>
+              <w:t xml:space="preserve">(Extended Service Set)</w:t>
             </w:r>
           </w:p>
         </w:tc>
@@ -7371,7 +7371,7 @@
           <w:rPr>
             <w:rStyle w:val="Hyperlink"/>
           </w:rPr>
-          <w:t xml:space="preserve">03 · Estándares 802.11</w:t>
+          <w:t xml:space="preserve">3 · Estándares 802.11</w:t>
         </w:r>
       </w:hyperlink>
       <w:r>
@@ -7398,7 +7398,7 @@
           <w:rPr>
             <w:rStyle w:val="Hyperlink"/>
           </w:rPr>
-          <w:t xml:space="preserve">05 · Cobertura y diseño</w:t>
+          <w:t xml:space="preserve">5 · Cobertura y diseño</w:t>
         </w:r>
       </w:hyperlink>
     </w:p>
@@ -7410,7 +7410,7 @@
         <w:pStyle w:val="Heading1"/>
       </w:pPr>
       <w:r>
-        <w:t xml:space="preserve">05 — Cobertura y diseño</w:t>
+        <w:t xml:space="preserve">5 — Cobertura y diseño</w:t>
       </w:r>
     </w:p>
     <w:p>
@@ -7458,7 +7458,7 @@
         <w:t xml:space="preserve"> </w:t>
       </w:r>
       <w:r>
-        <w:t xml:space="preserve">→ 05 · Cobertura y diseño</w:t>
+        <w:t xml:space="preserve">→ 5 · Cobertura y diseño</w:t>
       </w:r>
     </w:p>
     <w:p>
@@ -8170,7 +8170,7 @@
         <w:t xml:space="preserve"> </w:t>
       </w:r>
       <w:r>
-        <w:t xml:space="preserve">con la red montada (o con un AP portátil), recorres el suelo con una laptop/app midiendo RSSI, SNR y canales por zona. Es la verdad de la calle: el hormigón armado y las estanterías metálicas no leen presupuestos.</w:t>
+        <w:t xml:space="preserve">con la red montada (o con un AP portátil), recorres el suelo con un portátil/app midiendo RSSI, SNR y canales por zona. Es la verdad de la calle: el hormigón armado y las estanterías metálicas no leen presupuestos.</w:t>
       </w:r>
     </w:p>
     <w:p>
@@ -8845,7 +8845,7 @@
           <w:rPr>
             <w:rStyle w:val="Hyperlink"/>
           </w:rPr>
-          <w:t xml:space="preserve">04 · Topologías y modos de trabajo</w:t>
+          <w:t xml:space="preserve">4 · Topologías y modos de trabajo</w:t>
         </w:r>
       </w:hyperlink>
       <w:r>
@@ -8872,7 +8872,7 @@
           <w:rPr>
             <w:rStyle w:val="Hyperlink"/>
           </w:rPr>
-          <w:t xml:space="preserve">06 · Seguridad WLAN</w:t>
+          <w:t xml:space="preserve">6 · Seguridad WLAN</w:t>
         </w:r>
       </w:hyperlink>
     </w:p>
@@ -8884,7 +8884,7 @@
         <w:pStyle w:val="Heading1"/>
       </w:pPr>
       <w:r>
-        <w:t xml:space="preserve">06 — Seguridad WLAN</w:t>
+        <w:t xml:space="preserve">6 — Seguridad WLAN</w:t>
       </w:r>
     </w:p>
     <w:p>
@@ -8932,7 +8932,7 @@
         <w:t xml:space="preserve"> </w:t>
       </w:r>
       <w:r>
-        <w:t xml:space="preserve">→ 06 · Seguridad WLAN</w:t>
+        <w:t xml:space="preserve">→ 6 · Seguridad WLAN</w:t>
       </w:r>
     </w:p>
     <w:p>
@@ -10525,7 +10525,7 @@
           <w:rPr>
             <w:rStyle w:val="Hyperlink"/>
           </w:rPr>
-          <w:t xml:space="preserve">05 · Cobertura y diseño</w:t>
+          <w:t xml:space="preserve">5 · Cobertura y diseño</w:t>
         </w:r>
       </w:hyperlink>
       <w:r>
@@ -10552,7 +10552,7 @@
           <w:rPr>
             <w:rStyle w:val="Hyperlink"/>
           </w:rPr>
-          <w:t xml:space="preserve">07 · APs y controladores</w:t>
+          <w:t xml:space="preserve">7 · APs y controladores</w:t>
         </w:r>
       </w:hyperlink>
     </w:p>
@@ -10564,7 +10564,7 @@
         <w:pStyle w:val="Heading1"/>
       </w:pPr>
       <w:r>
-        <w:t xml:space="preserve">07 — APs y controladores</w:t>
+        <w:t xml:space="preserve">7 — APs y controladores</w:t>
       </w:r>
     </w:p>
     <w:p>
@@ -10612,7 +10612,7 @@
         <w:t xml:space="preserve"> </w:t>
       </w:r>
       <w:r>
-        <w:t xml:space="preserve">→ 07 · APs y controladores</w:t>
+        <w:t xml:space="preserve">→ 7 · APs y controladores</w:t>
       </w:r>
     </w:p>
     <w:p>
@@ -11385,7 +11385,7 @@
           <w:b/>
           <w:bCs/>
         </w:rPr>
-        <w:t xml:space="preserve">cloud/ embedded</w:t>
+        <w:t xml:space="preserve">en la nube o embebido</w:t>
       </w:r>
       <w:r>
         <w:t xml:space="preserve"> </w:t>
@@ -12398,7 +12398,7 @@
           <w:rPr>
             <w:rStyle w:val="Hyperlink"/>
           </w:rPr>
-          <w:t xml:space="preserve">06 · Seguridad WLAN</w:t>
+          <w:t xml:space="preserve">6 · Seguridad WLAN</w:t>
         </w:r>
       </w:hyperlink>
       <w:r>
@@ -12425,19 +12425,19 @@
           <w:rPr>
             <w:rStyle w:val="Hyperlink"/>
           </w:rPr>
-          <w:t xml:space="preserve">08 · Configuración y verificación</w:t>
+          <w:t xml:space="preserve">8 · Configuración y verificación</w:t>
         </w:r>
       </w:hyperlink>
     </w:p>
     <w:bookmarkEnd w:id="87"/>
     <w:bookmarkEnd w:id="88"/>
-    <w:bookmarkStart w:id="101" w:name="configuración-y-verificación"/>
+    <w:bookmarkStart w:id="102" w:name="configuración-y-verificación"/>
     <w:p>
       <w:pPr>
         <w:pStyle w:val="Heading1"/>
       </w:pPr>
       <w:r>
-        <w:t xml:space="preserve">08 — Configuración y verificación</w:t>
+        <w:t xml:space="preserve">8 — Configuración y verificación</w:t>
       </w:r>
     </w:p>
     <w:p>
@@ -12485,7 +12485,7 @@
         <w:t xml:space="preserve"> </w:t>
       </w:r>
       <w:r>
-        <w:t xml:space="preserve">→ 08 · Configuración y verificación</w:t>
+        <w:t xml:space="preserve">→ 8 · Configuración y verificación</w:t>
       </w:r>
     </w:p>
     <w:p>
@@ -12520,7 +12520,7 @@
       </w:r>
     </w:p>
     <w:bookmarkEnd w:id="89"/>
-    <w:bookmarkStart w:id="94" w:name="escenario-base-en-packet-tracer"/>
+    <w:bookmarkStart w:id="95" w:name="escenario-base-en-packet-tracer"/>
     <w:p>
       <w:pPr>
         <w:pStyle w:val="Heading2"/>
@@ -12604,7 +12604,7 @@
         <w:t xml:space="preserve">(VLAN 99, WPA2-PSK distinta, aislada) — con DHCP desde el router para ambas VLANs.</w:t>
       </w:r>
     </w:p>
-    <w:bookmarkStart w:id="90" w:name="paso-1-el-router-gateway-y-dhcp"/>
+    <w:bookmarkStart w:id="91" w:name="paso-1-el-router-gateway-y-dhcp"/>
     <w:p>
       <w:pPr>
         <w:pStyle w:val="Heading3"/>
@@ -12722,9 +12722,79 @@
         </w:rPr>
         <w:t xml:space="preserve">Router(dhcp-config)# default-router 192.168.99.1</w:t>
       </w:r>
-    </w:p>
-    <w:bookmarkEnd w:id="90"/>
-    <w:bookmarkStart w:id="91" w:name="paso-2-el-switch-trunk-hacia-el-ap"/>
+      <w:r>
+        <w:br/>
+      </w:r>
+      <w:r>
+        <w:rPr>
+          <w:rStyle w:val="VerbatimChar"/>
+        </w:rPr>
+        <w:t xml:space="preserve">Router(config)# access-list 110 deny ip 192.168.99.0 0.0.0.255 192.168.10.0 0.0.0.255</w:t>
+      </w:r>
+      <w:r>
+        <w:br/>
+      </w:r>
+      <w:r>
+        <w:rPr>
+          <w:rStyle w:val="VerbatimChar"/>
+        </w:rPr>
+        <w:t xml:space="preserve">Router(config)# access-list 110 permit ip any any</w:t>
+      </w:r>
+      <w:r>
+        <w:br/>
+      </w:r>
+      <w:r>
+        <w:rPr>
+          <w:rStyle w:val="VerbatimChar"/>
+        </w:rPr>
+        <w:t xml:space="preserve">Router(config)# interface gigabitEthernet 0/0.99</w:t>
+      </w:r>
+      <w:r>
+        <w:br/>
+      </w:r>
+      <w:r>
+        <w:rPr>
+          <w:rStyle w:val="VerbatimChar"/>
+        </w:rPr>
+        <w:t xml:space="preserve">Router(config-subif)# ip access-group 110 in</w:t>
+      </w:r>
+    </w:p>
+    <w:p>
+      <w:pPr>
+        <w:pStyle w:val="BlockText"/>
+      </w:pPr>
+      <w:r>
+        <w:t xml:space="preserve">💡 La ACL 110 es la que hace real el aislamiento de</w:t>
+      </w:r>
+      <w:r>
+        <w:t xml:space="preserve"> </w:t>
+      </w:r>
+      <w:r>
+        <w:rPr>
+          <w:rStyle w:val="VerbatimChar"/>
+        </w:rPr>
+        <w:t xml:space="preserve">INVITADOS</w:t>
+      </w:r>
+      <w:r>
+        <w:t xml:space="preserve">: sin ella, el router enruta entre las dos VLANs y los invitados pingen a la VLAN 10. La montas a fondo en la</w:t>
+      </w:r>
+      <w:r>
+        <w:t xml:space="preserve"> </w:t>
+      </w:r>
+      <w:hyperlink r:id="rId90">
+        <w:r>
+          <w:rPr>
+            <w:rStyle w:val="Hyperlink"/>
+          </w:rPr>
+          <w:t xml:space="preserve">unidad de ACL y seguridad</w:t>
+        </w:r>
+      </w:hyperlink>
+      <w:r>
+        <w:t xml:space="preserve">.</w:t>
+      </w:r>
+    </w:p>
+    <w:bookmarkEnd w:id="91"/>
+    <w:bookmarkStart w:id="92" w:name="paso-2-el-switch-trunk-hacia-el-ap"/>
     <w:p>
       <w:pPr>
         <w:pStyle w:val="Heading3"/>
@@ -12762,8 +12832,8 @@
         <w:t xml:space="preserve">Switch(config-if)# switchport trunk allowed vlan 10,99</w:t>
       </w:r>
     </w:p>
-    <w:bookmarkEnd w:id="91"/>
-    <w:bookmarkStart w:id="92" w:name="paso-3-el-ap-ssids-y-seguridad"/>
+    <w:bookmarkEnd w:id="92"/>
+    <w:bookmarkStart w:id="93" w:name="paso-3-el-ap-ssids-y-seguridad"/>
     <w:p>
       <w:pPr>
         <w:pStyle w:val="Heading3"/>
@@ -12975,7 +13045,7 @@
         <w:pStyle w:val="BodyText"/>
       </w:pPr>
       <w:r>
-        <w:t xml:space="preserve">En APs con varias SSIDs se asigna cada SSID a su VLAN en la configuración; en los AP domésticos de Packet Tracer trabaja con una SSID principal, así que para el laboratorio multissid usa un AP profesional o dos APs (uno por SSID/VLAN), conectando cada uno a un puerto access de su VLAN.</w:t>
+        <w:t xml:space="preserve">En APs con varias SSIDs se asigna cada SSID a su VLAN en la configuración; en los AP domésticos de Packet Tracer solo se trabaja con una SSID principal, así que para el laboratorio multissid usa un AP profesional o dos APs (uno por SSID/VLAN), conectando cada uno a un puerto access de su VLAN.</w:t>
       </w:r>
     </w:p>
     <w:p>
@@ -13030,8 +13100,8 @@
         <w:t xml:space="preserve">de principiante casi siempre es eso.</w:t>
       </w:r>
     </w:p>
-    <w:bookmarkEnd w:id="92"/>
-    <w:bookmarkStart w:id="93" w:name="paso-4-clientes-y-verificación"/>
+    <w:bookmarkEnd w:id="93"/>
+    <w:bookmarkStart w:id="94" w:name="paso-4-clientes-y-verificación"/>
     <w:p>
       <w:pPr>
         <w:pStyle w:val="Heading3"/>
@@ -13255,9 +13325,9 @@
         </w:pict>
       </w:r>
     </w:p>
-    <w:bookmarkEnd w:id="93"/>
     <w:bookmarkEnd w:id="94"/>
-    <w:bookmarkStart w:id="95" w:name="Xb3f9502492aa430821c8d740f6851336ddf06ef"/>
+    <w:bookmarkEnd w:id="95"/>
+    <w:bookmarkStart w:id="96" w:name="Xb3f9502492aa430821c8d740f6851336ddf06ef"/>
     <w:p>
       <w:pPr>
         <w:pStyle w:val="Heading2"/>
@@ -13355,6 +13425,15 @@
           <w:rStyle w:val="VerbatimChar"/>
         </w:rPr>
         <w:t xml:space="preserve">AP(config-if)# power local 50       ← potencia moderada</w:t>
+      </w:r>
+      <w:r>
+        <w:br/>
+      </w:r>
+      <w:r>
+        <w:rPr>
+          <w:rStyle w:val="VerbatimChar"/>
+        </w:rPr>
+        <w:t xml:space="preserve">AP(config)# interface dot11Radio 0.10</w:t>
       </w:r>
       <w:r>
         <w:br/>
@@ -13406,8 +13485,8 @@
         </w:pict>
       </w:r>
     </w:p>
-    <w:bookmarkEnd w:id="95"/>
-    <w:bookmarkStart w:id="96" w:name="verificación-y-diagnóstico-wlan"/>
+    <w:bookmarkEnd w:id="96"/>
+    <w:bookmarkStart w:id="97" w:name="verificación-y-diagnóstico-wlan"/>
     <w:p>
       <w:pPr>
         <w:pStyle w:val="Heading2"/>
@@ -13661,7 +13740,7 @@
               <w:pStyle w:val="Compact"/>
             </w:pPr>
             <w:r>
-              <w:t xml:space="preserve">WiFi analyzer (móvil/laptop)</w:t>
+              <w:t xml:space="preserve">WiFi analyzer (móvil/portátil)</w:t>
             </w:r>
           </w:p>
         </w:tc>
@@ -13776,8 +13855,8 @@
         </w:pict>
       </w:r>
     </w:p>
-    <w:bookmarkEnd w:id="96"/>
-    <w:bookmarkStart w:id="97" w:name="X8dc504ccdb842fb32c933aed5c91bd75b924d2b"/>
+    <w:bookmarkEnd w:id="97"/>
+    <w:bookmarkStart w:id="98" w:name="X8dc504ccdb842fb32c933aed5c91bd75b924d2b"/>
     <w:p>
       <w:pPr>
         <w:pStyle w:val="Heading2"/>
@@ -13893,8 +13972,8 @@
         </w:pict>
       </w:r>
     </w:p>
-    <w:bookmarkEnd w:id="97"/>
-    <w:bookmarkStart w:id="98" w:name="mini-chequeo-7"/>
+    <w:bookmarkEnd w:id="98"/>
+    <w:bookmarkStart w:id="99" w:name="mini-chequeo-7"/>
     <w:p>
       <w:pPr>
         <w:pStyle w:val="Heading2"/>
@@ -14116,8 +14195,8 @@
         </w:pict>
       </w:r>
     </w:p>
-    <w:bookmarkEnd w:id="98"/>
-    <w:bookmarkStart w:id="99" w:name="resumen-en-3-frases-7"/>
+    <w:bookmarkEnd w:id="99"/>
+    <w:bookmarkStart w:id="100" w:name="resumen-en-3-frases-7"/>
     <w:p>
       <w:pPr>
         <w:pStyle w:val="Heading2"/>
@@ -14175,8 +14254,8 @@
         <w:t xml:space="preserve">El diagnóstico WLAN reutiliza la escalera universal: ¿ve, conecta, IP, gateway, nombres?</w:t>
       </w:r>
     </w:p>
-    <w:bookmarkEnd w:id="99"/>
-    <w:bookmarkStart w:id="100" w:name="vocabulario-rápido-7"/>
+    <w:bookmarkEnd w:id="100"/>
+    <w:bookmarkStart w:id="101" w:name="vocabulario-rápido-7"/>
     <w:p>
       <w:pPr>
         <w:pStyle w:val="Heading2"/>
@@ -14241,7 +14320,7 @@
               <w:pStyle w:val="Compact"/>
             </w:pPr>
             <w:r>
-              <w:t xml:space="preserve">Adaptador inalámbrico de laptop en Packet Tracer</w:t>
+              <w:t xml:space="preserve">Adaptador inalámbrico de portátil en Packet Tracer</w:t>
             </w:r>
           </w:p>
         </w:tc>
@@ -14404,7 +14483,7 @@
           <w:rPr>
             <w:rStyle w:val="Hyperlink"/>
           </w:rPr>
-          <w:t xml:space="preserve">07 · APs y controladores</w:t>
+          <w:t xml:space="preserve">7 · APs y controladores</w:t>
         </w:r>
       </w:hyperlink>
       <w:r>
@@ -14431,13 +14510,13 @@
           <w:rPr>
             <w:rStyle w:val="Hyperlink"/>
           </w:rPr>
-          <w:t xml:space="preserve">09 · Cierre</w:t>
+          <w:t xml:space="preserve">9 · Cierre</w:t>
         </w:r>
       </w:hyperlink>
     </w:p>
-    <w:bookmarkEnd w:id="100"/>
     <w:bookmarkEnd w:id="101"/>
-    <w:bookmarkStart w:id="114" w:name="cierre-consolida-lo-aprendido"/>
+    <w:bookmarkEnd w:id="102"/>
+    <w:bookmarkStart w:id="115" w:name="cierre-consolida-lo-aprendido"/>
     <w:p>
       <w:pPr>
         <w:pStyle w:val="Heading1"/>
@@ -14533,7 +14612,7 @@
         </w:pict>
       </w:r>
     </w:p>
-    <w:bookmarkStart w:id="102" w:name="sé-el-paquete"/>
+    <w:bookmarkStart w:id="103" w:name="sé-el-paquete"/>
     <w:p>
       <w:pPr>
         <w:pStyle w:val="Heading2"/>
@@ -14783,8 +14862,8 @@
         </w:pict>
       </w:r>
     </w:p>
-    <w:bookmarkEnd w:id="102"/>
-    <w:bookmarkStart w:id="103" w:name="fireside-chat-wifi-vs-cable"/>
+    <w:bookmarkEnd w:id="103"/>
+    <w:bookmarkStart w:id="104" w:name="fireside-chat-wifi-vs-cable"/>
     <w:p>
       <w:pPr>
         <w:pStyle w:val="Heading2"/>
@@ -14978,8 +15057,8 @@
         </w:pict>
       </w:r>
     </w:p>
-    <w:bookmarkEnd w:id="103"/>
-    <w:bookmarkStart w:id="104" w:name="quién-soy"/>
+    <w:bookmarkEnd w:id="104"/>
+    <w:bookmarkStart w:id="105" w:name="quién-soy"/>
     <w:p>
       <w:pPr>
         <w:pStyle w:val="Heading2"/>
@@ -15135,8 +15214,8 @@
         </w:pict>
       </w:r>
     </w:p>
-    <w:bookmarkEnd w:id="104"/>
-    <w:bookmarkStart w:id="105" w:name="X881598bfe1028ed13eb749aa413f4deccde98bb"/>
+    <w:bookmarkEnd w:id="105"/>
+    <w:bookmarkStart w:id="106" w:name="X881598bfe1028ed13eb749aa413f4deccde98bb"/>
     <w:p>
       <w:pPr>
         <w:pStyle w:val="Heading2"/>
@@ -15254,8 +15333,8 @@
         </w:pict>
       </w:r>
     </w:p>
-    <w:bookmarkEnd w:id="105"/>
-    <w:bookmarkStart w:id="106" w:name="X20bfaf9c97b458f1ec52501bba1eb6d13772ef2"/>
+    <w:bookmarkEnd w:id="106"/>
+    <w:bookmarkStart w:id="107" w:name="X20bfaf9c97b458f1ec52501bba1eb6d13772ef2"/>
     <w:p>
       <w:pPr>
         <w:pStyle w:val="Heading2"/>
@@ -15295,7 +15374,7 @@
         <w:t xml:space="preserve"> </w:t>
       </w:r>
       <w:r>
-        <w:t xml:space="preserve">Packet Tracer — 1 router 2911, 1 switch 2960, 2 APs domésticos, 3 laptops (WPC300N), 1 PC</w:t>
+        <w:t xml:space="preserve">Packet Tracer — 1 router 2911, 1 switch 2960, 2 APs domésticos, 3 portátiles (WPC300N), 1 PC</w:t>
       </w:r>
     </w:p>
     <w:p>
@@ -15313,7 +15392,7 @@
         <w:t xml:space="preserve"> </w:t>
       </w:r>
       <w:r>
-        <w:t xml:space="preserve">Router → Switch; del switch salen PC-1 (VLAN 10), AP-1 (trunk 10,99) y AP-2 (trunk 10,99). Las laptops se reparten entre ambos APs.</w:t>
+        <w:t xml:space="preserve">Router → Switch; del switch salen PC-1 (VLAN 10), AP-1 (trunk 10,99) y AP-2 (trunk 10,99). Los portátiles se reparten entre ambos APs.</w:t>
       </w:r>
     </w:p>
     <w:p>
@@ -15331,7 +15410,7 @@
         <w:t xml:space="preserve"> </w:t>
       </w:r>
       <w:r>
-        <w:t xml:space="preserve">1. Router: subinterfaces .10 y .99 (gateway 192.168.10.1 y 192.168.99.1) + pool DHCP para ambas VLANs.</w:t>
+        <w:t xml:space="preserve">1. Router: subinterfaces .10 y .99 (gateway 192.168.10.1 y 192.168.99.1) + pool DHCP para ambas VLANs + ACL 110 (deny 99→10 y permit any) aplicada entrante en la subinterfaz .99 — es la que hará que los invitados no pingen a la VLAN 10 (recuerda de la unidad de ACL).</w:t>
       </w:r>
       <w:r>
         <w:t xml:space="preserve"> </w:t>
@@ -15379,7 +15458,7 @@
         <w:t xml:space="preserve"> </w:t>
       </w:r>
       <w:r>
-        <w:t xml:space="preserve">4. Verifica: laptops de</w:t>
+        <w:t xml:space="preserve">4. Verifica: portátiles de</w:t>
       </w:r>
       <w:r>
         <w:t xml:space="preserve"> </w:t>
@@ -15608,8 +15687,8 @@
         </w:pict>
       </w:r>
     </w:p>
-    <w:bookmarkEnd w:id="106"/>
-    <w:bookmarkStart w:id="107" w:name="logros-de-esta-unidad"/>
+    <w:bookmarkEnd w:id="107"/>
+    <w:bookmarkStart w:id="108" w:name="logros-de-esta-unidad"/>
     <w:p>
       <w:pPr>
         <w:pStyle w:val="Heading2"/>
@@ -15800,8 +15879,8 @@
         </w:pict>
       </w:r>
     </w:p>
-    <w:bookmarkEnd w:id="107"/>
-    <w:bookmarkStart w:id="108" w:name="atrévete-a-pensar"/>
+    <w:bookmarkEnd w:id="108"/>
+    <w:bookmarkStart w:id="109" w:name="atrévete-a-pensar"/>
     <w:p>
       <w:pPr>
         <w:pStyle w:val="Heading2"/>
@@ -15996,8 +16075,8 @@
         </w:pict>
       </w:r>
     </w:p>
-    <w:bookmarkEnd w:id="108"/>
-    <w:bookmarkStart w:id="109" w:name="crucigrama-de-bits"/>
+    <w:bookmarkEnd w:id="109"/>
+    <w:bookmarkStart w:id="110" w:name="crucigrama-de-bits"/>
     <w:p>
       <w:pPr>
         <w:pStyle w:val="Heading2"/>
@@ -16143,8 +16222,8 @@
         </w:pict>
       </w:r>
     </w:p>
-    <w:bookmarkEnd w:id="109"/>
-    <w:bookmarkStart w:id="110" w:name="preguntas-de-entrevista-de-trabajo"/>
+    <w:bookmarkEnd w:id="110"/>
+    <w:bookmarkStart w:id="111" w:name="preguntas-de-entrevista-de-trabajo"/>
     <w:p>
       <w:pPr>
         <w:pStyle w:val="Heading2"/>
@@ -16297,8 +16376,8 @@
         </w:pict>
       </w:r>
     </w:p>
-    <w:bookmarkEnd w:id="110"/>
-    <w:bookmarkStart w:id="111" w:name="no-hay-preguntas-tontas"/>
+    <w:bookmarkEnd w:id="111"/>
+    <w:bookmarkStart w:id="112" w:name="no-hay-preguntas-tontas"/>
     <w:p>
       <w:pPr>
         <w:pStyle w:val="Heading2"/>
@@ -16487,8 +16566,8 @@
         </w:pict>
       </w:r>
     </w:p>
-    <w:bookmarkEnd w:id="111"/>
-    <w:bookmarkStart w:id="112" w:name="poscréditos"/>
+    <w:bookmarkEnd w:id="112"/>
+    <w:bookmarkStart w:id="113" w:name="poscréditos"/>
     <w:p>
       <w:pPr>
         <w:pStyle w:val="Heading2"/>
@@ -16564,8 +16643,8 @@
         </w:pict>
       </w:r>
     </w:p>
-    <w:bookmarkEnd w:id="112"/>
-    <w:bookmarkStart w:id="113" w:name="Xe5c9652d70275eff18ae7b599d66bd50ec929a5"/>
+    <w:bookmarkEnd w:id="113"/>
+    <w:bookmarkStart w:id="114" w:name="Xe5c9652d70275eff18ae7b599d66bd50ec929a5"/>
     <w:p>
       <w:pPr>
         <w:pStyle w:val="Heading2"/>
@@ -16857,8 +16936,8 @@
         </w:r>
       </w:hyperlink>
     </w:p>
-    <w:bookmarkEnd w:id="113"/>
     <w:bookmarkEnd w:id="114"/>
+    <w:bookmarkEnd w:id="115"/>
     <w:sectPr>
       <w:footnotePr>
         <w:numRestart w:val="eachSect"/>

</xml_diff>